<commit_message>
docs: update internship duration dates from 17/04/2026 to 30/07/2026 across report pages
</commit_message>
<xml_diff>
--- a/Student_Profile_Ngo_Nguyen_Viet_Thang.docx
+++ b/Student_Profile_Ngo_Nguyen_Viet_Thang.docx
@@ -1,6 +1,6 @@
 
 <file path=word/document.xml><?xml version="1.0" encoding="utf-8"?>
-<w:document xmlns:wpc="http://schemas.microsoft.com/office/word/2010/wordprocessingCanvas" xmlns:mc="http://schemas.openxmlformats.org/markup-compatibility/2006" xmlns:o="urn:schemas-microsoft-com:office:office" xmlns:r="http://schemas.openxmlformats.org/officeDocument/2006/relationships" xmlns:m="http://schemas.openxmlformats.org/officeDocument/2006/math" xmlns:v="urn:schemas-microsoft-com:vml" xmlns:wp14="http://schemas.microsoft.com/office/word/2010/wordprocessingDrawing" xmlns:wp="http://schemas.openxmlformats.org/drawingml/2006/wordprocessingDrawing" xmlns:w="http://schemas.openxmlformats.org/wordprocessingml/2006/main" xmlns:w14="http://schemas.microsoft.com/office/word/2010/wordml" xmlns:w10="urn:schemas-microsoft-com:office:word" xmlns:w15="http://schemas.microsoft.com/office/word/2012/wordml" xmlns:wpg="http://schemas.microsoft.com/office/word/2010/wordprocessingGroup" xmlns:wpi="http://schemas.microsoft.com/office/word/2010/wordprocessingInk" xmlns:wne="http://schemas.microsoft.com/office/word/2006/wordml" xmlns:wps="http://schemas.microsoft.com/office/word/2010/wordprocessingShape" xmlns:wpsCustomData="http://www.wps.cn/officeDocument/2013/wpsCustomData" mc:Ignorable="w14 w15 wp14">
+<w:document xmlns:wpc="http://schemas.microsoft.com/office/word/2010/wordprocessingCanvas" xmlns:cx="http://schemas.microsoft.com/office/drawing/2014/chartex" xmlns:cx1="http://schemas.microsoft.com/office/drawing/2015/9/8/chartex" xmlns:cx2="http://schemas.microsoft.com/office/drawing/2015/10/21/chartex" xmlns:cx3="http://schemas.microsoft.com/office/drawing/2016/5/9/chartex" xmlns:cx4="http://schemas.microsoft.com/office/drawing/2016/5/10/chartex" xmlns:cx5="http://schemas.microsoft.com/office/drawing/2016/5/11/chartex" xmlns:cx6="http://schemas.microsoft.com/office/drawing/2016/5/12/chartex" xmlns:cx7="http://schemas.microsoft.com/office/drawing/2016/5/13/chartex" xmlns:cx8="http://schemas.microsoft.com/office/drawing/2016/5/14/chartex" xmlns:mc="http://schemas.openxmlformats.org/markup-compatibility/2006" xmlns:o="urn:schemas-microsoft-com:office:office" xmlns:r="http://schemas.openxmlformats.org/officeDocument/2006/relationships" xmlns:m="http://schemas.openxmlformats.org/officeDocument/2006/math" xmlns:v="urn:schemas-microsoft-com:vml" xmlns:wp14="http://schemas.microsoft.com/office/word/2010/wordprocessingDrawing" xmlns:wp="http://schemas.openxmlformats.org/drawingml/2006/wordprocessingDrawing" xmlns:w="http://schemas.openxmlformats.org/wordprocessingml/2006/main" xmlns:w14="http://schemas.microsoft.com/office/word/2010/wordml" xmlns:w10="urn:schemas-microsoft-com:office:word" xmlns:w15="http://schemas.microsoft.com/office/word/2012/wordml" xmlns:wpg="http://schemas.microsoft.com/office/word/2010/wordprocessingGroup" xmlns:wpi="http://schemas.microsoft.com/office/word/2010/wordprocessingInk" xmlns:wne="http://schemas.microsoft.com/office/word/2006/wordml" xmlns:wps="http://schemas.microsoft.com/office/word/2010/wordprocessingShape" xmlns:wpsCustomData="http://www.wps.cn/officeDocument/2013/wpsCustomData" mc:Ignorable="w14 w15 wp14">
   <w:body>
     <w:p>
       <w:pPr>
@@ -106,7 +106,39 @@
         <w:t xml:space="preserve">Internship Duration: </w:t>
       </w:r>
       <w:r>
-        <w:t>From 04/05/2026 to 25/07/2026</w:t>
+        <w:t xml:space="preserve">From </w:t>
+      </w:r>
+      <w:r>
+        <w:rPr>
+          <w:rFonts w:hint="default"/>
+          <w:lang w:val="en-US"/>
+        </w:rPr>
+        <w:t>17</w:t>
+      </w:r>
+      <w:r>
+        <w:t>/0</w:t>
+      </w:r>
+      <w:r>
+        <w:rPr>
+          <w:rFonts w:hint="default"/>
+          <w:lang w:val="en-US"/>
+        </w:rPr>
+        <w:t>4</w:t>
+      </w:r>
+      <w:r>
+        <w:t xml:space="preserve">/2026 to </w:t>
+      </w:r>
+      <w:r>
+        <w:rPr>
+          <w:rFonts w:hint="default"/>
+          <w:lang w:val="en-US"/>
+        </w:rPr>
+        <w:t>30</w:t>
+      </w:r>
+      <w:bookmarkStart w:id="0" w:name="_GoBack"/>
+      <w:bookmarkEnd w:id="0"/>
+      <w:r>
+        <w:t>/07/2026</w:t>
       </w:r>
     </w:p>
     <w:p>
@@ -117,7 +149,6 @@
           <w:lang w:val="en-US"/>
         </w:rPr>
       </w:pPr>
-      <w:bookmarkStart w:id="0" w:name="_GoBack"/>
       <w:r>
         <w:rPr>
           <w:rFonts w:hint="default"/>
@@ -161,7 +192,6 @@
           </wp:inline>
         </w:drawing>
       </w:r>
-      <w:bookmarkEnd w:id="0"/>
     </w:p>
     <w:sectPr>
       <w:pgSz w:w="12240" w:h="15840"/>
@@ -421,30 +451,30 @@
     <w:lsdException w:uiPriority="99" w:name="table of authorities"/>
     <w:lsdException w:uiPriority="99" w:semiHidden="0" w:name="macro"/>
     <w:lsdException w:uiPriority="99" w:name="toa heading"/>
-    <w:lsdException w:uiPriority="99" w:semiHidden="0" w:name="List"/>
-    <w:lsdException w:uiPriority="99" w:semiHidden="0" w:name="List Bullet"/>
-    <w:lsdException w:uiPriority="99" w:semiHidden="0" w:name="List Number"/>
-    <w:lsdException w:uiPriority="99" w:semiHidden="0" w:name="List 2"/>
-    <w:lsdException w:uiPriority="99" w:semiHidden="0" w:name="List 3"/>
+    <w:lsdException w:qFormat="1" w:uiPriority="99" w:semiHidden="0" w:name="List"/>
+    <w:lsdException w:qFormat="1" w:uiPriority="99" w:semiHidden="0" w:name="List Bullet"/>
+    <w:lsdException w:qFormat="1" w:uiPriority="99" w:semiHidden="0" w:name="List Number"/>
+    <w:lsdException w:qFormat="1" w:uiPriority="99" w:semiHidden="0" w:name="List 2"/>
+    <w:lsdException w:qFormat="1" w:uiPriority="99" w:semiHidden="0" w:name="List 3"/>
     <w:lsdException w:uiPriority="99" w:name="List 4"/>
     <w:lsdException w:uiPriority="99" w:name="List 5"/>
-    <w:lsdException w:uiPriority="99" w:semiHidden="0" w:name="List Bullet 2"/>
-    <w:lsdException w:uiPriority="99" w:semiHidden="0" w:name="List Bullet 3"/>
+    <w:lsdException w:qFormat="1" w:uiPriority="99" w:semiHidden="0" w:name="List Bullet 2"/>
+    <w:lsdException w:qFormat="1" w:uiPriority="99" w:semiHidden="0" w:name="List Bullet 3"/>
     <w:lsdException w:uiPriority="99" w:name="List Bullet 4"/>
     <w:lsdException w:uiPriority="99" w:name="List Bullet 5"/>
-    <w:lsdException w:uiPriority="99" w:semiHidden="0" w:name="List Number 2"/>
+    <w:lsdException w:qFormat="1" w:uiPriority="99" w:semiHidden="0" w:name="List Number 2"/>
     <w:lsdException w:uiPriority="99" w:semiHidden="0" w:name="List Number 3"/>
     <w:lsdException w:uiPriority="99" w:name="List Number 4"/>
     <w:lsdException w:uiPriority="99" w:name="List Number 5"/>
     <w:lsdException w:qFormat="1" w:unhideWhenUsed="0" w:uiPriority="10" w:semiHidden="0" w:name="Title"/>
     <w:lsdException w:uiPriority="99" w:name="Closing"/>
     <w:lsdException w:uiPriority="99" w:name="Signature"/>
-    <w:lsdException w:uiPriority="1" w:name="Default Paragraph Font"/>
-    <w:lsdException w:uiPriority="99" w:semiHidden="0" w:name="Body Text"/>
+    <w:lsdException w:qFormat="1" w:uiPriority="1" w:name="Default Paragraph Font"/>
+    <w:lsdException w:qFormat="1" w:uiPriority="99" w:semiHidden="0" w:name="Body Text"/>
     <w:lsdException w:uiPriority="99" w:name="Body Text Indent"/>
-    <w:lsdException w:uiPriority="99" w:semiHidden="0" w:name="List Continue"/>
-    <w:lsdException w:uiPriority="99" w:semiHidden="0" w:name="List Continue 2"/>
-    <w:lsdException w:uiPriority="99" w:semiHidden="0" w:name="List Continue 3"/>
+    <w:lsdException w:qFormat="1" w:uiPriority="99" w:semiHidden="0" w:name="List Continue"/>
+    <w:lsdException w:qFormat="1" w:uiPriority="99" w:semiHidden="0" w:name="List Continue 2"/>
+    <w:lsdException w:qFormat="1" w:uiPriority="99" w:semiHidden="0" w:name="List Continue 3"/>
     <w:lsdException w:uiPriority="99" w:name="List Continue 4"/>
     <w:lsdException w:uiPriority="99" w:name="List Continue 5"/>
     <w:lsdException w:uiPriority="99" w:name="Message Header"/>
@@ -454,8 +484,8 @@
     <w:lsdException w:uiPriority="99" w:name="Body Text First Indent"/>
     <w:lsdException w:uiPriority="99" w:name="Body Text First Indent 2"/>
     <w:lsdException w:uiPriority="99" w:name="Note Heading"/>
-    <w:lsdException w:uiPriority="99" w:semiHidden="0" w:name="Body Text 2"/>
-    <w:lsdException w:uiPriority="99" w:semiHidden="0" w:name="Body Text 3"/>
+    <w:lsdException w:qFormat="1" w:uiPriority="99" w:semiHidden="0" w:name="Body Text 2"/>
+    <w:lsdException w:qFormat="1" w:uiPriority="99" w:semiHidden="0" w:name="Body Text 3"/>
     <w:lsdException w:uiPriority="99" w:name="Body Text Indent 2"/>
     <w:lsdException w:uiPriority="99" w:name="Body Text Indent 3"/>
     <w:lsdException w:uiPriority="99" w:name="Block Text"/>
@@ -477,7 +507,7 @@
     <w:lsdException w:uiPriority="99" w:name="HTML Sample"/>
     <w:lsdException w:uiPriority="99" w:name="HTML Typewriter"/>
     <w:lsdException w:uiPriority="99" w:name="HTML Variable"/>
-    <w:lsdException w:uiPriority="99" w:name="Normal Table"/>
+    <w:lsdException w:qFormat="1" w:uiPriority="99" w:name="Normal Table"/>
     <w:lsdException w:uiPriority="99" w:name="annotation subject"/>
     <w:lsdException w:uiPriority="99" w:name="Table Simple 1"/>
     <w:lsdException w:uiPriority="99" w:name="Table Simple 2"/>
@@ -527,104 +557,104 @@
     <w:lsdException w:qFormat="1" w:unhideWhenUsed="0" w:uiPriority="1" w:semiHidden="0" w:name="No Spacing"/>
     <w:lsdException w:unhideWhenUsed="0" w:uiPriority="60" w:semiHidden="0" w:name="Light Shading"/>
     <w:lsdException w:unhideWhenUsed="0" w:uiPriority="61" w:semiHidden="0" w:name="Light List"/>
-    <w:lsdException w:unhideWhenUsed="0" w:uiPriority="62" w:semiHidden="0" w:name="Light Grid"/>
-    <w:lsdException w:unhideWhenUsed="0" w:uiPriority="63" w:semiHidden="0" w:name="Medium Shading 1"/>
-    <w:lsdException w:unhideWhenUsed="0" w:uiPriority="64" w:semiHidden="0" w:name="Medium Shading 2"/>
-    <w:lsdException w:unhideWhenUsed="0" w:uiPriority="65" w:semiHidden="0" w:name="Medium List 1"/>
-    <w:lsdException w:unhideWhenUsed="0" w:uiPriority="66" w:semiHidden="0" w:name="Medium List 2"/>
-    <w:lsdException w:unhideWhenUsed="0" w:uiPriority="67" w:semiHidden="0" w:name="Medium Grid 1"/>
-    <w:lsdException w:unhideWhenUsed="0" w:uiPriority="68" w:semiHidden="0" w:name="Medium Grid 2"/>
-    <w:lsdException w:unhideWhenUsed="0" w:uiPriority="69" w:semiHidden="0" w:name="Medium Grid 3"/>
-    <w:lsdException w:unhideWhenUsed="0" w:uiPriority="70" w:semiHidden="0" w:name="Dark List"/>
-    <w:lsdException w:unhideWhenUsed="0" w:uiPriority="71" w:semiHidden="0" w:name="Colorful Shading"/>
-    <w:lsdException w:unhideWhenUsed="0" w:uiPriority="72" w:semiHidden="0" w:name="Colorful List"/>
+    <w:lsdException w:qFormat="1" w:unhideWhenUsed="0" w:uiPriority="62" w:semiHidden="0" w:name="Light Grid"/>
+    <w:lsdException w:qFormat="1" w:unhideWhenUsed="0" w:uiPriority="63" w:semiHidden="0" w:name="Medium Shading 1"/>
+    <w:lsdException w:qFormat="1" w:unhideWhenUsed="0" w:uiPriority="64" w:semiHidden="0" w:name="Medium Shading 2"/>
+    <w:lsdException w:qFormat="1" w:unhideWhenUsed="0" w:uiPriority="65" w:semiHidden="0" w:name="Medium List 1"/>
+    <w:lsdException w:qFormat="1" w:unhideWhenUsed="0" w:uiPriority="66" w:semiHidden="0" w:name="Medium List 2"/>
+    <w:lsdException w:qFormat="1" w:unhideWhenUsed="0" w:uiPriority="67" w:semiHidden="0" w:name="Medium Grid 1"/>
+    <w:lsdException w:qFormat="1" w:unhideWhenUsed="0" w:uiPriority="68" w:semiHidden="0" w:name="Medium Grid 2"/>
+    <w:lsdException w:qFormat="1" w:unhideWhenUsed="0" w:uiPriority="69" w:semiHidden="0" w:name="Medium Grid 3"/>
+    <w:lsdException w:qFormat="1" w:unhideWhenUsed="0" w:uiPriority="70" w:semiHidden="0" w:name="Dark List"/>
+    <w:lsdException w:qFormat="1" w:unhideWhenUsed="0" w:uiPriority="71" w:semiHidden="0" w:name="Colorful Shading"/>
+    <w:lsdException w:qFormat="1" w:unhideWhenUsed="0" w:uiPriority="72" w:semiHidden="0" w:name="Colorful List"/>
     <w:lsdException w:qFormat="1" w:unhideWhenUsed="0" w:uiPriority="73" w:semiHidden="0" w:name="Colorful Grid"/>
     <w:lsdException w:unhideWhenUsed="0" w:uiPriority="60" w:semiHidden="0" w:name="Light Shading Accent 1"/>
     <w:lsdException w:unhideWhenUsed="0" w:uiPriority="61" w:semiHidden="0" w:name="Light List Accent 1"/>
-    <w:lsdException w:unhideWhenUsed="0" w:uiPriority="62" w:semiHidden="0" w:name="Light Grid Accent 1"/>
-    <w:lsdException w:unhideWhenUsed="0" w:uiPriority="63" w:semiHidden="0" w:name="Medium Shading 1 Accent 1"/>
-    <w:lsdException w:unhideWhenUsed="0" w:uiPriority="64" w:semiHidden="0" w:name="Medium Shading 2 Accent 1"/>
-    <w:lsdException w:unhideWhenUsed="0" w:uiPriority="65" w:semiHidden="0" w:name="Medium List 1 Accent 1"/>
+    <w:lsdException w:qFormat="1" w:unhideWhenUsed="0" w:uiPriority="62" w:semiHidden="0" w:name="Light Grid Accent 1"/>
+    <w:lsdException w:qFormat="1" w:unhideWhenUsed="0" w:uiPriority="63" w:semiHidden="0" w:name="Medium Shading 1 Accent 1"/>
+    <w:lsdException w:qFormat="1" w:unhideWhenUsed="0" w:uiPriority="64" w:semiHidden="0" w:name="Medium Shading 2 Accent 1"/>
+    <w:lsdException w:qFormat="1" w:unhideWhenUsed="0" w:uiPriority="65" w:semiHidden="0" w:name="Medium List 1 Accent 1"/>
     <w:lsdException w:qFormat="1" w:unhideWhenUsed="0" w:uiPriority="34" w:semiHidden="0" w:name="List Paragraph"/>
     <w:lsdException w:qFormat="1" w:unhideWhenUsed="0" w:uiPriority="29" w:semiHidden="0" w:name="Quote"/>
     <w:lsdException w:qFormat="1" w:unhideWhenUsed="0" w:uiPriority="30" w:semiHidden="0" w:name="Intense Quote"/>
-    <w:lsdException w:unhideWhenUsed="0" w:uiPriority="66" w:semiHidden="0" w:name="Medium List 2 Accent 1"/>
-    <w:lsdException w:unhideWhenUsed="0" w:uiPriority="67" w:semiHidden="0" w:name="Medium Grid 1 Accent 1"/>
-    <w:lsdException w:unhideWhenUsed="0" w:uiPriority="68" w:semiHidden="0" w:name="Medium Grid 2 Accent 1"/>
-    <w:lsdException w:unhideWhenUsed="0" w:uiPriority="69" w:semiHidden="0" w:name="Medium Grid 3 Accent 1"/>
-    <w:lsdException w:unhideWhenUsed="0" w:uiPriority="70" w:semiHidden="0" w:name="Dark List Accent 1"/>
-    <w:lsdException w:unhideWhenUsed="0" w:uiPriority="71" w:semiHidden="0" w:name="Colorful Shading Accent 1"/>
-    <w:lsdException w:unhideWhenUsed="0" w:uiPriority="72" w:semiHidden="0" w:name="Colorful List Accent 1"/>
-    <w:lsdException w:unhideWhenUsed="0" w:uiPriority="73" w:semiHidden="0" w:name="Colorful Grid Accent 1"/>
-    <w:lsdException w:unhideWhenUsed="0" w:uiPriority="60" w:semiHidden="0" w:name="Light Shading Accent 2"/>
-    <w:lsdException w:unhideWhenUsed="0" w:uiPriority="61" w:semiHidden="0" w:name="Light List Accent 2"/>
-    <w:lsdException w:unhideWhenUsed="0" w:uiPriority="62" w:semiHidden="0" w:name="Light Grid Accent 2"/>
-    <w:lsdException w:unhideWhenUsed="0" w:uiPriority="63" w:semiHidden="0" w:name="Medium Shading 1 Accent 2"/>
-    <w:lsdException w:unhideWhenUsed="0" w:uiPriority="64" w:semiHidden="0" w:name="Medium Shading 2 Accent 2"/>
-    <w:lsdException w:unhideWhenUsed="0" w:uiPriority="65" w:semiHidden="0" w:name="Medium List 1 Accent 2"/>
-    <w:lsdException w:unhideWhenUsed="0" w:uiPriority="66" w:semiHidden="0" w:name="Medium List 2 Accent 2"/>
-    <w:lsdException w:unhideWhenUsed="0" w:uiPriority="67" w:semiHidden="0" w:name="Medium Grid 1 Accent 2"/>
-    <w:lsdException w:unhideWhenUsed="0" w:uiPriority="68" w:semiHidden="0" w:name="Medium Grid 2 Accent 2"/>
-    <w:lsdException w:unhideWhenUsed="0" w:uiPriority="69" w:semiHidden="0" w:name="Medium Grid 3 Accent 2"/>
-    <w:lsdException w:unhideWhenUsed="0" w:uiPriority="70" w:semiHidden="0" w:name="Dark List Accent 2"/>
-    <w:lsdException w:unhideWhenUsed="0" w:uiPriority="71" w:semiHidden="0" w:name="Colorful Shading Accent 2"/>
-    <w:lsdException w:unhideWhenUsed="0" w:uiPriority="72" w:semiHidden="0" w:name="Colorful List Accent 2"/>
+    <w:lsdException w:qFormat="1" w:unhideWhenUsed="0" w:uiPriority="66" w:semiHidden="0" w:name="Medium List 2 Accent 1"/>
+    <w:lsdException w:qFormat="1" w:unhideWhenUsed="0" w:uiPriority="67" w:semiHidden="0" w:name="Medium Grid 1 Accent 1"/>
+    <w:lsdException w:qFormat="1" w:unhideWhenUsed="0" w:uiPriority="68" w:semiHidden="0" w:name="Medium Grid 2 Accent 1"/>
+    <w:lsdException w:qFormat="1" w:unhideWhenUsed="0" w:uiPriority="69" w:semiHidden="0" w:name="Medium Grid 3 Accent 1"/>
+    <w:lsdException w:qFormat="1" w:unhideWhenUsed="0" w:uiPriority="70" w:semiHidden="0" w:name="Dark List Accent 1"/>
+    <w:lsdException w:qFormat="1" w:unhideWhenUsed="0" w:uiPriority="71" w:semiHidden="0" w:name="Colorful Shading Accent 1"/>
+    <w:lsdException w:qFormat="1" w:unhideWhenUsed="0" w:uiPriority="72" w:semiHidden="0" w:name="Colorful List Accent 1"/>
+    <w:lsdException w:qFormat="1" w:unhideWhenUsed="0" w:uiPriority="73" w:semiHidden="0" w:name="Colorful Grid Accent 1"/>
+    <w:lsdException w:qFormat="1" w:unhideWhenUsed="0" w:uiPriority="60" w:semiHidden="0" w:name="Light Shading Accent 2"/>
+    <w:lsdException w:qFormat="1" w:unhideWhenUsed="0" w:uiPriority="61" w:semiHidden="0" w:name="Light List Accent 2"/>
+    <w:lsdException w:qFormat="1" w:unhideWhenUsed="0" w:uiPriority="62" w:semiHidden="0" w:name="Light Grid Accent 2"/>
+    <w:lsdException w:qFormat="1" w:unhideWhenUsed="0" w:uiPriority="63" w:semiHidden="0" w:name="Medium Shading 1 Accent 2"/>
+    <w:lsdException w:qFormat="1" w:unhideWhenUsed="0" w:uiPriority="64" w:semiHidden="0" w:name="Medium Shading 2 Accent 2"/>
+    <w:lsdException w:qFormat="1" w:unhideWhenUsed="0" w:uiPriority="65" w:semiHidden="0" w:name="Medium List 1 Accent 2"/>
+    <w:lsdException w:qFormat="1" w:unhideWhenUsed="0" w:uiPriority="66" w:semiHidden="0" w:name="Medium List 2 Accent 2"/>
+    <w:lsdException w:qFormat="1" w:unhideWhenUsed="0" w:uiPriority="67" w:semiHidden="0" w:name="Medium Grid 1 Accent 2"/>
+    <w:lsdException w:qFormat="1" w:unhideWhenUsed="0" w:uiPriority="68" w:semiHidden="0" w:name="Medium Grid 2 Accent 2"/>
+    <w:lsdException w:qFormat="1" w:unhideWhenUsed="0" w:uiPriority="69" w:semiHidden="0" w:name="Medium Grid 3 Accent 2"/>
+    <w:lsdException w:qFormat="1" w:unhideWhenUsed="0" w:uiPriority="70" w:semiHidden="0" w:name="Dark List Accent 2"/>
+    <w:lsdException w:qFormat="1" w:unhideWhenUsed="0" w:uiPriority="71" w:semiHidden="0" w:name="Colorful Shading Accent 2"/>
+    <w:lsdException w:qFormat="1" w:unhideWhenUsed="0" w:uiPriority="72" w:semiHidden="0" w:name="Colorful List Accent 2"/>
     <w:lsdException w:unhideWhenUsed="0" w:uiPriority="73" w:semiHidden="0" w:name="Colorful Grid Accent 2"/>
-    <w:lsdException w:unhideWhenUsed="0" w:uiPriority="60" w:semiHidden="0" w:name="Light Shading Accent 3"/>
+    <w:lsdException w:qFormat="1" w:unhideWhenUsed="0" w:uiPriority="60" w:semiHidden="0" w:name="Light Shading Accent 3"/>
     <w:lsdException w:unhideWhenUsed="0" w:uiPriority="61" w:semiHidden="0" w:name="Light List Accent 3"/>
-    <w:lsdException w:unhideWhenUsed="0" w:uiPriority="62" w:semiHidden="0" w:name="Light Grid Accent 3"/>
-    <w:lsdException w:unhideWhenUsed="0" w:uiPriority="63" w:semiHidden="0" w:name="Medium Shading 1 Accent 3"/>
-    <w:lsdException w:unhideWhenUsed="0" w:uiPriority="64" w:semiHidden="0" w:name="Medium Shading 2 Accent 3"/>
-    <w:lsdException w:unhideWhenUsed="0" w:uiPriority="65" w:semiHidden="0" w:name="Medium List 1 Accent 3"/>
-    <w:lsdException w:unhideWhenUsed="0" w:uiPriority="66" w:semiHidden="0" w:name="Medium List 2 Accent 3"/>
-    <w:lsdException w:unhideWhenUsed="0" w:uiPriority="67" w:semiHidden="0" w:name="Medium Grid 1 Accent 3"/>
-    <w:lsdException w:unhideWhenUsed="0" w:uiPriority="68" w:semiHidden="0" w:name="Medium Grid 2 Accent 3"/>
-    <w:lsdException w:unhideWhenUsed="0" w:uiPriority="69" w:semiHidden="0" w:name="Medium Grid 3 Accent 3"/>
-    <w:lsdException w:unhideWhenUsed="0" w:uiPriority="70" w:semiHidden="0" w:name="Dark List Accent 3"/>
-    <w:lsdException w:unhideWhenUsed="0" w:uiPriority="71" w:semiHidden="0" w:name="Colorful Shading Accent 3"/>
-    <w:lsdException w:unhideWhenUsed="0" w:uiPriority="72" w:semiHidden="0" w:name="Colorful List Accent 3"/>
+    <w:lsdException w:qFormat="1" w:unhideWhenUsed="0" w:uiPriority="62" w:semiHidden="0" w:name="Light Grid Accent 3"/>
+    <w:lsdException w:qFormat="1" w:unhideWhenUsed="0" w:uiPriority="63" w:semiHidden="0" w:name="Medium Shading 1 Accent 3"/>
+    <w:lsdException w:qFormat="1" w:unhideWhenUsed="0" w:uiPriority="64" w:semiHidden="0" w:name="Medium Shading 2 Accent 3"/>
+    <w:lsdException w:qFormat="1" w:unhideWhenUsed="0" w:uiPriority="65" w:semiHidden="0" w:name="Medium List 1 Accent 3"/>
+    <w:lsdException w:qFormat="1" w:unhideWhenUsed="0" w:uiPriority="66" w:semiHidden="0" w:name="Medium List 2 Accent 3"/>
+    <w:lsdException w:qFormat="1" w:unhideWhenUsed="0" w:uiPriority="67" w:semiHidden="0" w:name="Medium Grid 1 Accent 3"/>
+    <w:lsdException w:qFormat="1" w:unhideWhenUsed="0" w:uiPriority="68" w:semiHidden="0" w:name="Medium Grid 2 Accent 3"/>
+    <w:lsdException w:qFormat="1" w:unhideWhenUsed="0" w:uiPriority="69" w:semiHidden="0" w:name="Medium Grid 3 Accent 3"/>
+    <w:lsdException w:qFormat="1" w:unhideWhenUsed="0" w:uiPriority="70" w:semiHidden="0" w:name="Dark List Accent 3"/>
+    <w:lsdException w:qFormat="1" w:unhideWhenUsed="0" w:uiPriority="71" w:semiHidden="0" w:name="Colorful Shading Accent 3"/>
+    <w:lsdException w:qFormat="1" w:unhideWhenUsed="0" w:uiPriority="72" w:semiHidden="0" w:name="Colorful List Accent 3"/>
     <w:lsdException w:qFormat="1" w:unhideWhenUsed="0" w:uiPriority="73" w:semiHidden="0" w:name="Colorful Grid Accent 3"/>
     <w:lsdException w:unhideWhenUsed="0" w:uiPriority="60" w:semiHidden="0" w:name="Light Shading Accent 4"/>
     <w:lsdException w:unhideWhenUsed="0" w:uiPriority="61" w:semiHidden="0" w:name="Light List Accent 4"/>
-    <w:lsdException w:unhideWhenUsed="0" w:uiPriority="62" w:semiHidden="0" w:name="Light Grid Accent 4"/>
-    <w:lsdException w:unhideWhenUsed="0" w:uiPriority="63" w:semiHidden="0" w:name="Medium Shading 1 Accent 4"/>
-    <w:lsdException w:unhideWhenUsed="0" w:uiPriority="64" w:semiHidden="0" w:name="Medium Shading 2 Accent 4"/>
-    <w:lsdException w:unhideWhenUsed="0" w:uiPriority="65" w:semiHidden="0" w:name="Medium List 1 Accent 4"/>
-    <w:lsdException w:unhideWhenUsed="0" w:uiPriority="66" w:semiHidden="0" w:name="Medium List 2 Accent 4"/>
-    <w:lsdException w:unhideWhenUsed="0" w:uiPriority="67" w:semiHidden="0" w:name="Medium Grid 1 Accent 4"/>
-    <w:lsdException w:unhideWhenUsed="0" w:uiPriority="68" w:semiHidden="0" w:name="Medium Grid 2 Accent 4"/>
-    <w:lsdException w:unhideWhenUsed="0" w:uiPriority="69" w:semiHidden="0" w:name="Medium Grid 3 Accent 4"/>
-    <w:lsdException w:unhideWhenUsed="0" w:uiPriority="70" w:semiHidden="0" w:name="Dark List Accent 4"/>
-    <w:lsdException w:unhideWhenUsed="0" w:uiPriority="71" w:semiHidden="0" w:name="Colorful Shading Accent 4"/>
-    <w:lsdException w:unhideWhenUsed="0" w:uiPriority="72" w:semiHidden="0" w:name="Colorful List Accent 4"/>
+    <w:lsdException w:qFormat="1" w:unhideWhenUsed="0" w:uiPriority="62" w:semiHidden="0" w:name="Light Grid Accent 4"/>
+    <w:lsdException w:qFormat="1" w:unhideWhenUsed="0" w:uiPriority="63" w:semiHidden="0" w:name="Medium Shading 1 Accent 4"/>
+    <w:lsdException w:qFormat="1" w:unhideWhenUsed="0" w:uiPriority="64" w:semiHidden="0" w:name="Medium Shading 2 Accent 4"/>
+    <w:lsdException w:qFormat="1" w:unhideWhenUsed="0" w:uiPriority="65" w:semiHidden="0" w:name="Medium List 1 Accent 4"/>
+    <w:lsdException w:qFormat="1" w:unhideWhenUsed="0" w:uiPriority="66" w:semiHidden="0" w:name="Medium List 2 Accent 4"/>
+    <w:lsdException w:qFormat="1" w:unhideWhenUsed="0" w:uiPriority="67" w:semiHidden="0" w:name="Medium Grid 1 Accent 4"/>
+    <w:lsdException w:qFormat="1" w:unhideWhenUsed="0" w:uiPriority="68" w:semiHidden="0" w:name="Medium Grid 2 Accent 4"/>
+    <w:lsdException w:qFormat="1" w:unhideWhenUsed="0" w:uiPriority="69" w:semiHidden="0" w:name="Medium Grid 3 Accent 4"/>
+    <w:lsdException w:qFormat="1" w:unhideWhenUsed="0" w:uiPriority="70" w:semiHidden="0" w:name="Dark List Accent 4"/>
+    <w:lsdException w:qFormat="1" w:unhideWhenUsed="0" w:uiPriority="71" w:semiHidden="0" w:name="Colorful Shading Accent 4"/>
+    <w:lsdException w:qFormat="1" w:unhideWhenUsed="0" w:uiPriority="72" w:semiHidden="0" w:name="Colorful List Accent 4"/>
     <w:lsdException w:unhideWhenUsed="0" w:uiPriority="73" w:semiHidden="0" w:name="Colorful Grid Accent 4"/>
     <w:lsdException w:unhideWhenUsed="0" w:uiPriority="60" w:semiHidden="0" w:name="Light Shading Accent 5"/>
     <w:lsdException w:unhideWhenUsed="0" w:uiPriority="61" w:semiHidden="0" w:name="Light List Accent 5"/>
-    <w:lsdException w:unhideWhenUsed="0" w:uiPriority="62" w:semiHidden="0" w:name="Light Grid Accent 5"/>
-    <w:lsdException w:unhideWhenUsed="0" w:uiPriority="63" w:semiHidden="0" w:name="Medium Shading 1 Accent 5"/>
-    <w:lsdException w:unhideWhenUsed="0" w:uiPriority="64" w:semiHidden="0" w:name="Medium Shading 2 Accent 5"/>
+    <w:lsdException w:qFormat="1" w:unhideWhenUsed="0" w:uiPriority="62" w:semiHidden="0" w:name="Light Grid Accent 5"/>
+    <w:lsdException w:qFormat="1" w:unhideWhenUsed="0" w:uiPriority="63" w:semiHidden="0" w:name="Medium Shading 1 Accent 5"/>
+    <w:lsdException w:qFormat="1" w:unhideWhenUsed="0" w:uiPriority="64" w:semiHidden="0" w:name="Medium Shading 2 Accent 5"/>
     <w:lsdException w:qFormat="1" w:unhideWhenUsed="0" w:uiPriority="65" w:semiHidden="0" w:name="Medium List 1 Accent 5"/>
-    <w:lsdException w:unhideWhenUsed="0" w:uiPriority="66" w:semiHidden="0" w:name="Medium List 2 Accent 5"/>
-    <w:lsdException w:unhideWhenUsed="0" w:uiPriority="67" w:semiHidden="0" w:name="Medium Grid 1 Accent 5"/>
-    <w:lsdException w:unhideWhenUsed="0" w:uiPriority="68" w:semiHidden="0" w:name="Medium Grid 2 Accent 5"/>
-    <w:lsdException w:unhideWhenUsed="0" w:uiPriority="69" w:semiHidden="0" w:name="Medium Grid 3 Accent 5"/>
-    <w:lsdException w:unhideWhenUsed="0" w:uiPriority="70" w:semiHidden="0" w:name="Dark List Accent 5"/>
-    <w:lsdException w:unhideWhenUsed="0" w:uiPriority="71" w:semiHidden="0" w:name="Colorful Shading Accent 5"/>
-    <w:lsdException w:unhideWhenUsed="0" w:uiPriority="72" w:semiHidden="0" w:name="Colorful List Accent 5"/>
+    <w:lsdException w:qFormat="1" w:unhideWhenUsed="0" w:uiPriority="66" w:semiHidden="0" w:name="Medium List 2 Accent 5"/>
+    <w:lsdException w:qFormat="1" w:unhideWhenUsed="0" w:uiPriority="67" w:semiHidden="0" w:name="Medium Grid 1 Accent 5"/>
+    <w:lsdException w:qFormat="1" w:unhideWhenUsed="0" w:uiPriority="68" w:semiHidden="0" w:name="Medium Grid 2 Accent 5"/>
+    <w:lsdException w:qFormat="1" w:unhideWhenUsed="0" w:uiPriority="69" w:semiHidden="0" w:name="Medium Grid 3 Accent 5"/>
+    <w:lsdException w:qFormat="1" w:unhideWhenUsed="0" w:uiPriority="70" w:semiHidden="0" w:name="Dark List Accent 5"/>
+    <w:lsdException w:qFormat="1" w:unhideWhenUsed="0" w:uiPriority="71" w:semiHidden="0" w:name="Colorful Shading Accent 5"/>
+    <w:lsdException w:qFormat="1" w:unhideWhenUsed="0" w:uiPriority="72" w:semiHidden="0" w:name="Colorful List Accent 5"/>
     <w:lsdException w:unhideWhenUsed="0" w:uiPriority="73" w:semiHidden="0" w:name="Colorful Grid Accent 5"/>
-    <w:lsdException w:unhideWhenUsed="0" w:uiPriority="60" w:semiHidden="0" w:name="Light Shading Accent 6"/>
-    <w:lsdException w:unhideWhenUsed="0" w:uiPriority="61" w:semiHidden="0" w:name="Light List Accent 6"/>
-    <w:lsdException w:unhideWhenUsed="0" w:uiPriority="62" w:semiHidden="0" w:name="Light Grid Accent 6"/>
-    <w:lsdException w:unhideWhenUsed="0" w:uiPriority="63" w:semiHidden="0" w:name="Medium Shading 1 Accent 6"/>
-    <w:lsdException w:unhideWhenUsed="0" w:uiPriority="64" w:semiHidden="0" w:name="Medium Shading 2 Accent 6"/>
-    <w:lsdException w:unhideWhenUsed="0" w:uiPriority="65" w:semiHidden="0" w:name="Medium List 1 Accent 6"/>
-    <w:lsdException w:unhideWhenUsed="0" w:uiPriority="66" w:semiHidden="0" w:name="Medium List 2 Accent 6"/>
-    <w:lsdException w:unhideWhenUsed="0" w:uiPriority="67" w:semiHidden="0" w:name="Medium Grid 1 Accent 6"/>
-    <w:lsdException w:unhideWhenUsed="0" w:uiPriority="68" w:semiHidden="0" w:name="Medium Grid 2 Accent 6"/>
-    <w:lsdException w:unhideWhenUsed="0" w:uiPriority="69" w:semiHidden="0" w:name="Medium Grid 3 Accent 6"/>
-    <w:lsdException w:unhideWhenUsed="0" w:uiPriority="70" w:semiHidden="0" w:name="Dark List Accent 6"/>
-    <w:lsdException w:unhideWhenUsed="0" w:uiPriority="71" w:semiHidden="0" w:name="Colorful Shading Accent 6"/>
-    <w:lsdException w:unhideWhenUsed="0" w:uiPriority="72" w:semiHidden="0" w:name="Colorful List Accent 6"/>
+    <w:lsdException w:qFormat="1" w:unhideWhenUsed="0" w:uiPriority="60" w:semiHidden="0" w:name="Light Shading Accent 6"/>
+    <w:lsdException w:qFormat="1" w:unhideWhenUsed="0" w:uiPriority="61" w:semiHidden="0" w:name="Light List Accent 6"/>
+    <w:lsdException w:qFormat="1" w:unhideWhenUsed="0" w:uiPriority="62" w:semiHidden="0" w:name="Light Grid Accent 6"/>
+    <w:lsdException w:qFormat="1" w:unhideWhenUsed="0" w:uiPriority="63" w:semiHidden="0" w:name="Medium Shading 1 Accent 6"/>
+    <w:lsdException w:qFormat="1" w:unhideWhenUsed="0" w:uiPriority="64" w:semiHidden="0" w:name="Medium Shading 2 Accent 6"/>
+    <w:lsdException w:qFormat="1" w:unhideWhenUsed="0" w:uiPriority="65" w:semiHidden="0" w:name="Medium List 1 Accent 6"/>
+    <w:lsdException w:qFormat="1" w:unhideWhenUsed="0" w:uiPriority="66" w:semiHidden="0" w:name="Medium List 2 Accent 6"/>
+    <w:lsdException w:qFormat="1" w:unhideWhenUsed="0" w:uiPriority="67" w:semiHidden="0" w:name="Medium Grid 1 Accent 6"/>
+    <w:lsdException w:qFormat="1" w:unhideWhenUsed="0" w:uiPriority="68" w:semiHidden="0" w:name="Medium Grid 2 Accent 6"/>
+    <w:lsdException w:qFormat="1" w:unhideWhenUsed="0" w:uiPriority="69" w:semiHidden="0" w:name="Medium Grid 3 Accent 6"/>
+    <w:lsdException w:qFormat="1" w:unhideWhenUsed="0" w:uiPriority="70" w:semiHidden="0" w:name="Dark List Accent 6"/>
+    <w:lsdException w:qFormat="1" w:unhideWhenUsed="0" w:uiPriority="71" w:semiHidden="0" w:name="Colorful Shading Accent 6"/>
+    <w:lsdException w:qFormat="1" w:unhideWhenUsed="0" w:uiPriority="72" w:semiHidden="0" w:name="Colorful List Accent 6"/>
     <w:lsdException w:unhideWhenUsed="0" w:uiPriority="73" w:semiHidden="0" w:name="Colorful Grid Accent 6"/>
   </w:latentStyles>
   <w:style w:type="paragraph" w:default="1" w:styleId="1">
@@ -881,12 +911,14 @@
     <w:name w:val="Default Paragraph Font"/>
     <w:semiHidden/>
     <w:unhideWhenUsed/>
+    <w:qFormat/>
     <w:uiPriority w:val="1"/>
   </w:style>
   <w:style w:type="table" w:default="1" w:styleId="12">
     <w:name w:val="Normal Table"/>
     <w:semiHidden/>
     <w:unhideWhenUsed/>
+    <w:qFormat/>
     <w:uiPriority w:val="99"/>
     <w:tblPr>
       <w:tblCellMar>
@@ -902,6 +934,7 @@
     <w:basedOn w:val="1"/>
     <w:link w:val="144"/>
     <w:unhideWhenUsed/>
+    <w:qFormat/>
     <w:uiPriority w:val="99"/>
     <w:pPr>
       <w:spacing w:after="120"/>
@@ -912,6 +945,7 @@
     <w:basedOn w:val="1"/>
     <w:link w:val="145"/>
     <w:unhideWhenUsed/>
+    <w:qFormat/>
     <w:uiPriority w:val="99"/>
     <w:pPr>
       <w:spacing w:after="120" w:line="480" w:lineRule="auto"/>
@@ -922,6 +956,7 @@
     <w:basedOn w:val="1"/>
     <w:link w:val="146"/>
     <w:unhideWhenUsed/>
+    <w:qFormat/>
     <w:uiPriority w:val="99"/>
     <w:pPr>
       <w:spacing w:after="120"/>
@@ -999,6 +1034,7 @@
     <w:name w:val="List"/>
     <w:basedOn w:val="1"/>
     <w:unhideWhenUsed/>
+    <w:qFormat/>
     <w:uiPriority w:val="99"/>
     <w:pPr>
       <w:ind w:left="360" w:hanging="360"/>
@@ -1009,6 +1045,7 @@
     <w:name w:val="List 2"/>
     <w:basedOn w:val="1"/>
     <w:unhideWhenUsed/>
+    <w:qFormat/>
     <w:uiPriority w:val="99"/>
     <w:pPr>
       <w:ind w:left="720" w:hanging="360"/>
@@ -1019,6 +1056,7 @@
     <w:name w:val="List 3"/>
     <w:basedOn w:val="1"/>
     <w:unhideWhenUsed/>
+    <w:qFormat/>
     <w:uiPriority w:val="99"/>
     <w:pPr>
       <w:ind w:left="1080" w:hanging="360"/>
@@ -1029,6 +1067,7 @@
     <w:name w:val="List Bullet"/>
     <w:basedOn w:val="1"/>
     <w:unhideWhenUsed/>
+    <w:qFormat/>
     <w:uiPriority w:val="99"/>
     <w:pPr>
       <w:numPr>
@@ -1042,6 +1081,7 @@
     <w:name w:val="List Bullet 2"/>
     <w:basedOn w:val="1"/>
     <w:unhideWhenUsed/>
+    <w:qFormat/>
     <w:uiPriority w:val="99"/>
     <w:pPr>
       <w:numPr>
@@ -1055,6 +1095,7 @@
     <w:name w:val="List Bullet 3"/>
     <w:basedOn w:val="1"/>
     <w:unhideWhenUsed/>
+    <w:qFormat/>
     <w:uiPriority w:val="99"/>
     <w:pPr>
       <w:numPr>
@@ -1068,6 +1109,7 @@
     <w:name w:val="List Continue"/>
     <w:basedOn w:val="1"/>
     <w:unhideWhenUsed/>
+    <w:qFormat/>
     <w:uiPriority w:val="99"/>
     <w:pPr>
       <w:spacing w:after="120"/>
@@ -1079,6 +1121,7 @@
     <w:name w:val="List Continue 2"/>
     <w:basedOn w:val="1"/>
     <w:unhideWhenUsed/>
+    <w:qFormat/>
     <w:uiPriority w:val="99"/>
     <w:pPr>
       <w:spacing w:after="120"/>
@@ -1090,6 +1133,7 @@
     <w:name w:val="List Continue 3"/>
     <w:basedOn w:val="1"/>
     <w:unhideWhenUsed/>
+    <w:qFormat/>
     <w:uiPriority w:val="99"/>
     <w:pPr>
       <w:spacing w:after="120"/>
@@ -1101,6 +1145,7 @@
     <w:name w:val="List Number"/>
     <w:basedOn w:val="1"/>
     <w:unhideWhenUsed/>
+    <w:qFormat/>
     <w:uiPriority w:val="99"/>
     <w:pPr>
       <w:numPr>
@@ -1114,6 +1159,7 @@
     <w:name w:val="List Number 2"/>
     <w:basedOn w:val="1"/>
     <w:unhideWhenUsed/>
+    <w:qFormat/>
     <w:uiPriority w:val="99"/>
     <w:pPr>
       <w:numPr>
@@ -1440,6 +1486,7 @@
   <w:style w:type="table" w:styleId="39">
     <w:name w:val="Light Shading Accent 2"/>
     <w:basedOn w:val="12"/>
+    <w:qFormat/>
     <w:uiPriority w:val="60"/>
     <w:pPr>
       <w:spacing w:after="0" w:line="240" w:lineRule="auto"/>
@@ -1539,6 +1586,7 @@
   <w:style w:type="table" w:styleId="40">
     <w:name w:val="Light Shading Accent 3"/>
     <w:basedOn w:val="12"/>
+    <w:qFormat/>
     <w:uiPriority w:val="60"/>
     <w:pPr>
       <w:spacing w:after="0" w:line="240" w:lineRule="auto"/>
@@ -1836,6 +1884,7 @@
   <w:style w:type="table" w:styleId="43">
     <w:name w:val="Light Shading Accent 6"/>
     <w:basedOn w:val="12"/>
+    <w:qFormat/>
     <w:uiPriority w:val="60"/>
     <w:pPr>
       <w:spacing w:after="0" w:line="240" w:lineRule="auto"/>
@@ -2121,6 +2170,7 @@
   <w:style w:type="table" w:styleId="46">
     <w:name w:val="Light List Accent 2"/>
     <w:basedOn w:val="12"/>
+    <w:qFormat/>
     <w:uiPriority w:val="61"/>
     <w:pPr>
       <w:spacing w:after="0" w:line="240" w:lineRule="auto"/>
@@ -2493,6 +2543,7 @@
   <w:style w:type="table" w:styleId="50">
     <w:name w:val="Light List Accent 6"/>
     <w:basedOn w:val="12"/>
+    <w:qFormat/>
     <w:uiPriority w:val="61"/>
     <w:pPr>
       <w:spacing w:after="0" w:line="240" w:lineRule="auto"/>
@@ -2586,6 +2637,7 @@
   <w:style w:type="table" w:styleId="51">
     <w:name w:val="Light Grid"/>
     <w:basedOn w:val="12"/>
+    <w:qFormat/>
     <w:uiPriority w:val="62"/>
     <w:pPr>
       <w:spacing w:after="0" w:line="240" w:lineRule="auto"/>
@@ -2712,6 +2764,7 @@
   <w:style w:type="table" w:styleId="52">
     <w:name w:val="Light Grid Accent 1"/>
     <w:basedOn w:val="12"/>
+    <w:qFormat/>
     <w:uiPriority w:val="62"/>
     <w:pPr>
       <w:spacing w:after="0" w:line="240" w:lineRule="auto"/>
@@ -2838,6 +2891,7 @@
   <w:style w:type="table" w:styleId="53">
     <w:name w:val="Light Grid Accent 2"/>
     <w:basedOn w:val="12"/>
+    <w:qFormat/>
     <w:uiPriority w:val="62"/>
     <w:pPr>
       <w:spacing w:after="0" w:line="240" w:lineRule="auto"/>
@@ -2964,6 +3018,7 @@
   <w:style w:type="table" w:styleId="54">
     <w:name w:val="Light Grid Accent 3"/>
     <w:basedOn w:val="12"/>
+    <w:qFormat/>
     <w:uiPriority w:val="62"/>
     <w:pPr>
       <w:spacing w:after="0" w:line="240" w:lineRule="auto"/>
@@ -3090,6 +3145,7 @@
   <w:style w:type="table" w:styleId="55">
     <w:name w:val="Light Grid Accent 4"/>
     <w:basedOn w:val="12"/>
+    <w:qFormat/>
     <w:uiPriority w:val="62"/>
     <w:pPr>
       <w:spacing w:after="0" w:line="240" w:lineRule="auto"/>
@@ -3216,6 +3272,7 @@
   <w:style w:type="table" w:styleId="56">
     <w:name w:val="Light Grid Accent 5"/>
     <w:basedOn w:val="12"/>
+    <w:qFormat/>
     <w:uiPriority w:val="62"/>
     <w:pPr>
       <w:spacing w:after="0" w:line="240" w:lineRule="auto"/>
@@ -3342,6 +3399,7 @@
   <w:style w:type="table" w:styleId="57">
     <w:name w:val="Light Grid Accent 6"/>
     <w:basedOn w:val="12"/>
+    <w:qFormat/>
     <w:uiPriority w:val="62"/>
     <w:pPr>
       <w:spacing w:after="0" w:line="240" w:lineRule="auto"/>
@@ -3468,6 +3526,7 @@
   <w:style w:type="table" w:styleId="58">
     <w:name w:val="Medium Shading 1"/>
     <w:basedOn w:val="12"/>
+    <w:qFormat/>
     <w:uiPriority w:val="63"/>
     <w:pPr>
       <w:spacing w:after="0" w:line="240" w:lineRule="auto"/>
@@ -3575,6 +3634,7 @@
   <w:style w:type="table" w:styleId="59">
     <w:name w:val="Medium Shading 1 Accent 1"/>
     <w:basedOn w:val="12"/>
+    <w:qFormat/>
     <w:uiPriority w:val="63"/>
     <w:pPr>
       <w:spacing w:after="0" w:line="240" w:lineRule="auto"/>
@@ -3682,6 +3742,7 @@
   <w:style w:type="table" w:styleId="60">
     <w:name w:val="Medium Shading 1 Accent 2"/>
     <w:basedOn w:val="12"/>
+    <w:qFormat/>
     <w:uiPriority w:val="63"/>
     <w:pPr>
       <w:spacing w:after="0" w:line="240" w:lineRule="auto"/>
@@ -3789,6 +3850,7 @@
   <w:style w:type="table" w:styleId="61">
     <w:name w:val="Medium Shading 1 Accent 3"/>
     <w:basedOn w:val="12"/>
+    <w:qFormat/>
     <w:uiPriority w:val="63"/>
     <w:pPr>
       <w:spacing w:after="0" w:line="240" w:lineRule="auto"/>
@@ -3896,6 +3958,7 @@
   <w:style w:type="table" w:styleId="62">
     <w:name w:val="Medium Shading 1 Accent 4"/>
     <w:basedOn w:val="12"/>
+    <w:qFormat/>
     <w:uiPriority w:val="63"/>
     <w:pPr>
       <w:spacing w:after="0" w:line="240" w:lineRule="auto"/>
@@ -4003,6 +4066,7 @@
   <w:style w:type="table" w:styleId="63">
     <w:name w:val="Medium Shading 1 Accent 5"/>
     <w:basedOn w:val="12"/>
+    <w:qFormat/>
     <w:uiPriority w:val="63"/>
     <w:pPr>
       <w:spacing w:after="0" w:line="240" w:lineRule="auto"/>
@@ -4110,6 +4174,7 @@
   <w:style w:type="table" w:styleId="64">
     <w:name w:val="Medium Shading 1 Accent 6"/>
     <w:basedOn w:val="12"/>
+    <w:qFormat/>
     <w:uiPriority w:val="63"/>
     <w:pPr>
       <w:spacing w:after="0" w:line="240" w:lineRule="auto"/>
@@ -4217,6 +4282,7 @@
   <w:style w:type="table" w:styleId="65">
     <w:name w:val="Medium Shading 2"/>
     <w:basedOn w:val="12"/>
+    <w:qFormat/>
     <w:uiPriority w:val="64"/>
     <w:pPr>
       <w:spacing w:after="0" w:line="240" w:lineRule="auto"/>
@@ -4382,6 +4448,7 @@
   <w:style w:type="table" w:styleId="66">
     <w:name w:val="Medium Shading 2 Accent 1"/>
     <w:basedOn w:val="12"/>
+    <w:qFormat/>
     <w:uiPriority w:val="64"/>
     <w:pPr>
       <w:spacing w:after="0" w:line="240" w:lineRule="auto"/>
@@ -4547,6 +4614,7 @@
   <w:style w:type="table" w:styleId="67">
     <w:name w:val="Medium Shading 2 Accent 2"/>
     <w:basedOn w:val="12"/>
+    <w:qFormat/>
     <w:uiPriority w:val="64"/>
     <w:pPr>
       <w:spacing w:after="0" w:line="240" w:lineRule="auto"/>
@@ -4712,6 +4780,7 @@
   <w:style w:type="table" w:styleId="68">
     <w:name w:val="Medium Shading 2 Accent 3"/>
     <w:basedOn w:val="12"/>
+    <w:qFormat/>
     <w:uiPriority w:val="64"/>
     <w:pPr>
       <w:spacing w:after="0" w:line="240" w:lineRule="auto"/>
@@ -4877,6 +4946,7 @@
   <w:style w:type="table" w:styleId="69">
     <w:name w:val="Medium Shading 2 Accent 4"/>
     <w:basedOn w:val="12"/>
+    <w:qFormat/>
     <w:uiPriority w:val="64"/>
     <w:pPr>
       <w:spacing w:after="0" w:line="240" w:lineRule="auto"/>
@@ -5042,6 +5112,7 @@
   <w:style w:type="table" w:styleId="70">
     <w:name w:val="Medium Shading 2 Accent 5"/>
     <w:basedOn w:val="12"/>
+    <w:qFormat/>
     <w:uiPriority w:val="64"/>
     <w:pPr>
       <w:spacing w:after="0" w:line="240" w:lineRule="auto"/>
@@ -5207,6 +5278,7 @@
   <w:style w:type="table" w:styleId="71">
     <w:name w:val="Medium Shading 2 Accent 6"/>
     <w:basedOn w:val="12"/>
+    <w:qFormat/>
     <w:uiPriority w:val="64"/>
     <w:pPr>
       <w:spacing w:after="0" w:line="240" w:lineRule="auto"/>
@@ -5372,6 +5444,7 @@
   <w:style w:type="table" w:styleId="72">
     <w:name w:val="Medium List 1"/>
     <w:basedOn w:val="12"/>
+    <w:qFormat/>
     <w:uiPriority w:val="65"/>
     <w:pPr>
       <w:spacing w:after="0" w:line="240" w:lineRule="auto"/>
@@ -5462,6 +5535,7 @@
   <w:style w:type="table" w:styleId="73">
     <w:name w:val="Medium List 1 Accent 1"/>
     <w:basedOn w:val="12"/>
+    <w:qFormat/>
     <w:uiPriority w:val="65"/>
     <w:pPr>
       <w:spacing w:after="0" w:line="240" w:lineRule="auto"/>
@@ -5552,6 +5626,7 @@
   <w:style w:type="table" w:styleId="74">
     <w:name w:val="Medium List 1 Accent 2"/>
     <w:basedOn w:val="12"/>
+    <w:qFormat/>
     <w:uiPriority w:val="65"/>
     <w:pPr>
       <w:spacing w:after="0" w:line="240" w:lineRule="auto"/>
@@ -5642,6 +5717,7 @@
   <w:style w:type="table" w:styleId="75">
     <w:name w:val="Medium List 1 Accent 3"/>
     <w:basedOn w:val="12"/>
+    <w:qFormat/>
     <w:uiPriority w:val="65"/>
     <w:pPr>
       <w:spacing w:after="0" w:line="240" w:lineRule="auto"/>
@@ -5732,6 +5808,7 @@
   <w:style w:type="table" w:styleId="76">
     <w:name w:val="Medium List 1 Accent 4"/>
     <w:basedOn w:val="12"/>
+    <w:qFormat/>
     <w:uiPriority w:val="65"/>
     <w:pPr>
       <w:spacing w:after="0" w:line="240" w:lineRule="auto"/>
@@ -5913,6 +5990,7 @@
   <w:style w:type="table" w:styleId="78">
     <w:name w:val="Medium List 1 Accent 6"/>
     <w:basedOn w:val="12"/>
+    <w:qFormat/>
     <w:uiPriority w:val="65"/>
     <w:pPr>
       <w:spacing w:after="0" w:line="240" w:lineRule="auto"/>
@@ -6003,6 +6081,7 @@
   <w:style w:type="table" w:styleId="79">
     <w:name w:val="Medium List 2"/>
     <w:basedOn w:val="12"/>
+    <w:qFormat/>
     <w:uiPriority w:val="66"/>
     <w:pPr>
       <w:spacing w:after="0" w:line="240" w:lineRule="auto"/>
@@ -6132,6 +6211,7 @@
   <w:style w:type="table" w:styleId="80">
     <w:name w:val="Medium List 2 Accent 1"/>
     <w:basedOn w:val="12"/>
+    <w:qFormat/>
     <w:uiPriority w:val="66"/>
     <w:pPr>
       <w:spacing w:after="0" w:line="240" w:lineRule="auto"/>
@@ -6261,6 +6341,7 @@
   <w:style w:type="table" w:styleId="81">
     <w:name w:val="Medium List 2 Accent 2"/>
     <w:basedOn w:val="12"/>
+    <w:qFormat/>
     <w:uiPriority w:val="66"/>
     <w:pPr>
       <w:spacing w:after="0" w:line="240" w:lineRule="auto"/>
@@ -6390,6 +6471,7 @@
   <w:style w:type="table" w:styleId="82">
     <w:name w:val="Medium List 2 Accent 3"/>
     <w:basedOn w:val="12"/>
+    <w:qFormat/>
     <w:uiPriority w:val="66"/>
     <w:pPr>
       <w:spacing w:after="0" w:line="240" w:lineRule="auto"/>
@@ -6519,6 +6601,7 @@
   <w:style w:type="table" w:styleId="83">
     <w:name w:val="Medium List 2 Accent 4"/>
     <w:basedOn w:val="12"/>
+    <w:qFormat/>
     <w:uiPriority w:val="66"/>
     <w:pPr>
       <w:spacing w:after="0" w:line="240" w:lineRule="auto"/>
@@ -6648,6 +6731,7 @@
   <w:style w:type="table" w:styleId="84">
     <w:name w:val="Medium List 2 Accent 5"/>
     <w:basedOn w:val="12"/>
+    <w:qFormat/>
     <w:uiPriority w:val="66"/>
     <w:pPr>
       <w:spacing w:after="0" w:line="240" w:lineRule="auto"/>
@@ -6777,6 +6861,7 @@
   <w:style w:type="table" w:styleId="85">
     <w:name w:val="Medium List 2 Accent 6"/>
     <w:basedOn w:val="12"/>
+    <w:qFormat/>
     <w:uiPriority w:val="66"/>
     <w:pPr>
       <w:spacing w:after="0" w:line="240" w:lineRule="auto"/>
@@ -6906,6 +6991,7 @@
   <w:style w:type="table" w:styleId="86">
     <w:name w:val="Medium Grid 1"/>
     <w:basedOn w:val="12"/>
+    <w:qFormat/>
     <w:uiPriority w:val="67"/>
     <w:pPr>
       <w:spacing w:after="0" w:line="240" w:lineRule="auto"/>
@@ -6975,6 +7061,7 @@
   <w:style w:type="table" w:styleId="87">
     <w:name w:val="Medium Grid 1 Accent 1"/>
     <w:basedOn w:val="12"/>
+    <w:qFormat/>
     <w:uiPriority w:val="67"/>
     <w:pPr>
       <w:spacing w:after="0" w:line="240" w:lineRule="auto"/>
@@ -7044,6 +7131,7 @@
   <w:style w:type="table" w:styleId="88">
     <w:name w:val="Medium Grid 1 Accent 2"/>
     <w:basedOn w:val="12"/>
+    <w:qFormat/>
     <w:uiPriority w:val="67"/>
     <w:pPr>
       <w:spacing w:after="0" w:line="240" w:lineRule="auto"/>
@@ -7113,6 +7201,7 @@
   <w:style w:type="table" w:styleId="89">
     <w:name w:val="Medium Grid 1 Accent 3"/>
     <w:basedOn w:val="12"/>
+    <w:qFormat/>
     <w:uiPriority w:val="67"/>
     <w:pPr>
       <w:spacing w:after="0" w:line="240" w:lineRule="auto"/>
@@ -7182,6 +7271,7 @@
   <w:style w:type="table" w:styleId="90">
     <w:name w:val="Medium Grid 1 Accent 4"/>
     <w:basedOn w:val="12"/>
+    <w:qFormat/>
     <w:uiPriority w:val="67"/>
     <w:pPr>
       <w:spacing w:after="0" w:line="240" w:lineRule="auto"/>
@@ -7251,6 +7341,7 @@
   <w:style w:type="table" w:styleId="91">
     <w:name w:val="Medium Grid 1 Accent 5"/>
     <w:basedOn w:val="12"/>
+    <w:qFormat/>
     <w:uiPriority w:val="67"/>
     <w:pPr>
       <w:spacing w:after="0" w:line="240" w:lineRule="auto"/>
@@ -7320,6 +7411,7 @@
   <w:style w:type="table" w:styleId="92">
     <w:name w:val="Medium Grid 1 Accent 6"/>
     <w:basedOn w:val="12"/>
+    <w:qFormat/>
     <w:uiPriority w:val="67"/>
     <w:pPr>
       <w:spacing w:after="0" w:line="240" w:lineRule="auto"/>
@@ -7389,6 +7481,7 @@
   <w:style w:type="table" w:styleId="93">
     <w:name w:val="Medium Grid 2"/>
     <w:basedOn w:val="12"/>
+    <w:qFormat/>
     <w:uiPriority w:val="68"/>
     <w:pPr>
       <w:spacing w:after="0" w:line="240" w:lineRule="auto"/>
@@ -7535,6 +7628,7 @@
   <w:style w:type="table" w:styleId="94">
     <w:name w:val="Medium Grid 2 Accent 1"/>
     <w:basedOn w:val="12"/>
+    <w:qFormat/>
     <w:uiPriority w:val="68"/>
     <w:pPr>
       <w:spacing w:after="0" w:line="240" w:lineRule="auto"/>
@@ -7681,6 +7775,7 @@
   <w:style w:type="table" w:styleId="95">
     <w:name w:val="Medium Grid 2 Accent 2"/>
     <w:basedOn w:val="12"/>
+    <w:qFormat/>
     <w:uiPriority w:val="68"/>
     <w:pPr>
       <w:spacing w:after="0" w:line="240" w:lineRule="auto"/>
@@ -7827,6 +7922,7 @@
   <w:style w:type="table" w:styleId="96">
     <w:name w:val="Medium Grid 2 Accent 3"/>
     <w:basedOn w:val="12"/>
+    <w:qFormat/>
     <w:uiPriority w:val="68"/>
     <w:pPr>
       <w:spacing w:after="0" w:line="240" w:lineRule="auto"/>
@@ -7973,6 +8069,7 @@
   <w:style w:type="table" w:styleId="97">
     <w:name w:val="Medium Grid 2 Accent 4"/>
     <w:basedOn w:val="12"/>
+    <w:qFormat/>
     <w:uiPriority w:val="68"/>
     <w:pPr>
       <w:spacing w:after="0" w:line="240" w:lineRule="auto"/>
@@ -8119,6 +8216,7 @@
   <w:style w:type="table" w:styleId="98">
     <w:name w:val="Medium Grid 2 Accent 5"/>
     <w:basedOn w:val="12"/>
+    <w:qFormat/>
     <w:uiPriority w:val="68"/>
     <w:pPr>
       <w:spacing w:after="0" w:line="240" w:lineRule="auto"/>
@@ -8265,6 +8363,7 @@
   <w:style w:type="table" w:styleId="99">
     <w:name w:val="Medium Grid 2 Accent 6"/>
     <w:basedOn w:val="12"/>
+    <w:qFormat/>
     <w:uiPriority w:val="68"/>
     <w:pPr>
       <w:spacing w:after="0" w:line="240" w:lineRule="auto"/>
@@ -8411,6 +8510,7 @@
   <w:style w:type="table" w:styleId="100">
     <w:name w:val="Medium Grid 3"/>
     <w:basedOn w:val="12"/>
+    <w:qFormat/>
     <w:uiPriority w:val="69"/>
     <w:pPr>
       <w:spacing w:after="0" w:line="240" w:lineRule="auto"/>
@@ -8568,6 +8668,7 @@
   <w:style w:type="table" w:styleId="101">
     <w:name w:val="Medium Grid 3 Accent 1"/>
     <w:basedOn w:val="12"/>
+    <w:qFormat/>
     <w:uiPriority w:val="69"/>
     <w:pPr>
       <w:spacing w:after="0" w:line="240" w:lineRule="auto"/>
@@ -8725,6 +8826,7 @@
   <w:style w:type="table" w:styleId="102">
     <w:name w:val="Medium Grid 3 Accent 2"/>
     <w:basedOn w:val="12"/>
+    <w:qFormat/>
     <w:uiPriority w:val="69"/>
     <w:pPr>
       <w:spacing w:after="0" w:line="240" w:lineRule="auto"/>
@@ -8882,6 +8984,7 @@
   <w:style w:type="table" w:styleId="103">
     <w:name w:val="Medium Grid 3 Accent 3"/>
     <w:basedOn w:val="12"/>
+    <w:qFormat/>
     <w:uiPriority w:val="69"/>
     <w:pPr>
       <w:spacing w:after="0" w:line="240" w:lineRule="auto"/>
@@ -9039,6 +9142,7 @@
   <w:style w:type="table" w:styleId="104">
     <w:name w:val="Medium Grid 3 Accent 4"/>
     <w:basedOn w:val="12"/>
+    <w:qFormat/>
     <w:uiPriority w:val="69"/>
     <w:pPr>
       <w:spacing w:after="0" w:line="240" w:lineRule="auto"/>
@@ -9196,6 +9300,7 @@
   <w:style w:type="table" w:styleId="105">
     <w:name w:val="Medium Grid 3 Accent 5"/>
     <w:basedOn w:val="12"/>
+    <w:qFormat/>
     <w:uiPriority w:val="69"/>
     <w:pPr>
       <w:spacing w:after="0" w:line="240" w:lineRule="auto"/>
@@ -9353,6 +9458,7 @@
   <w:style w:type="table" w:styleId="106">
     <w:name w:val="Medium Grid 3 Accent 6"/>
     <w:basedOn w:val="12"/>
+    <w:qFormat/>
     <w:uiPriority w:val="69"/>
     <w:pPr>
       <w:spacing w:after="0" w:line="240" w:lineRule="auto"/>
@@ -9510,6 +9616,7 @@
   <w:style w:type="table" w:styleId="107">
     <w:name w:val="Dark List"/>
     <w:basedOn w:val="12"/>
+    <w:qFormat/>
     <w:uiPriority w:val="70"/>
     <w:pPr>
       <w:spacing w:after="0" w:line="240" w:lineRule="auto"/>
@@ -9625,6 +9732,7 @@
   <w:style w:type="table" w:styleId="108">
     <w:name w:val="Dark List Accent 1"/>
     <w:basedOn w:val="12"/>
+    <w:qFormat/>
     <w:uiPriority w:val="70"/>
     <w:pPr>
       <w:spacing w:after="0" w:line="240" w:lineRule="auto"/>
@@ -9740,6 +9848,7 @@
   <w:style w:type="table" w:styleId="109">
     <w:name w:val="Dark List Accent 2"/>
     <w:basedOn w:val="12"/>
+    <w:qFormat/>
     <w:uiPriority w:val="70"/>
     <w:pPr>
       <w:spacing w:after="0" w:line="240" w:lineRule="auto"/>
@@ -9855,6 +9964,7 @@
   <w:style w:type="table" w:styleId="110">
     <w:name w:val="Dark List Accent 3"/>
     <w:basedOn w:val="12"/>
+    <w:qFormat/>
     <w:uiPriority w:val="70"/>
     <w:pPr>
       <w:spacing w:after="0" w:line="240" w:lineRule="auto"/>
@@ -9970,6 +10080,7 @@
   <w:style w:type="table" w:styleId="111">
     <w:name w:val="Dark List Accent 4"/>
     <w:basedOn w:val="12"/>
+    <w:qFormat/>
     <w:uiPriority w:val="70"/>
     <w:pPr>
       <w:spacing w:after="0" w:line="240" w:lineRule="auto"/>
@@ -10085,6 +10196,7 @@
   <w:style w:type="table" w:styleId="112">
     <w:name w:val="Dark List Accent 5"/>
     <w:basedOn w:val="12"/>
+    <w:qFormat/>
     <w:uiPriority w:val="70"/>
     <w:pPr>
       <w:spacing w:after="0" w:line="240" w:lineRule="auto"/>
@@ -10200,6 +10312,7 @@
   <w:style w:type="table" w:styleId="113">
     <w:name w:val="Dark List Accent 6"/>
     <w:basedOn w:val="12"/>
+    <w:qFormat/>
     <w:uiPriority w:val="70"/>
     <w:pPr>
       <w:spacing w:after="0" w:line="240" w:lineRule="auto"/>
@@ -10315,6 +10428,7 @@
   <w:style w:type="table" w:styleId="114">
     <w:name w:val="Colorful Shading"/>
     <w:basedOn w:val="12"/>
+    <w:qFormat/>
     <w:uiPriority w:val="71"/>
     <w:pPr>
       <w:spacing w:after="0" w:line="240" w:lineRule="auto"/>
@@ -10463,6 +10577,7 @@
   <w:style w:type="table" w:styleId="115">
     <w:name w:val="Colorful Shading Accent 1"/>
     <w:basedOn w:val="12"/>
+    <w:qFormat/>
     <w:uiPriority w:val="71"/>
     <w:pPr>
       <w:spacing w:after="0" w:line="240" w:lineRule="auto"/>
@@ -10611,6 +10726,7 @@
   <w:style w:type="table" w:styleId="116">
     <w:name w:val="Colorful Shading Accent 2"/>
     <w:basedOn w:val="12"/>
+    <w:qFormat/>
     <w:uiPriority w:val="71"/>
     <w:pPr>
       <w:spacing w:after="0" w:line="240" w:lineRule="auto"/>
@@ -10759,6 +10875,7 @@
   <w:style w:type="table" w:styleId="117">
     <w:name w:val="Colorful Shading Accent 3"/>
     <w:basedOn w:val="12"/>
+    <w:qFormat/>
     <w:uiPriority w:val="71"/>
     <w:pPr>
       <w:spacing w:after="0" w:line="240" w:lineRule="auto"/>
@@ -10887,6 +11004,7 @@
   <w:style w:type="table" w:styleId="118">
     <w:name w:val="Colorful Shading Accent 4"/>
     <w:basedOn w:val="12"/>
+    <w:qFormat/>
     <w:uiPriority w:val="71"/>
     <w:pPr>
       <w:spacing w:after="0" w:line="240" w:lineRule="auto"/>
@@ -11035,6 +11153,7 @@
   <w:style w:type="table" w:styleId="119">
     <w:name w:val="Colorful Shading Accent 5"/>
     <w:basedOn w:val="12"/>
+    <w:qFormat/>
     <w:uiPriority w:val="71"/>
     <w:pPr>
       <w:spacing w:after="0" w:line="240" w:lineRule="auto"/>
@@ -11183,6 +11302,7 @@
   <w:style w:type="table" w:styleId="120">
     <w:name w:val="Colorful Shading Accent 6"/>
     <w:basedOn w:val="12"/>
+    <w:qFormat/>
     <w:uiPriority w:val="71"/>
     <w:pPr>
       <w:spacing w:after="0" w:line="240" w:lineRule="auto"/>
@@ -11331,6 +11451,7 @@
   <w:style w:type="table" w:styleId="121">
     <w:name w:val="Colorful List"/>
     <w:basedOn w:val="12"/>
+    <w:qFormat/>
     <w:uiPriority w:val="72"/>
     <w:pPr>
       <w:spacing w:after="0" w:line="240" w:lineRule="auto"/>
@@ -11423,6 +11544,7 @@
   <w:style w:type="table" w:styleId="122">
     <w:name w:val="Colorful List Accent 1"/>
     <w:basedOn w:val="12"/>
+    <w:qFormat/>
     <w:uiPriority w:val="72"/>
     <w:pPr>
       <w:spacing w:after="0" w:line="240" w:lineRule="auto"/>
@@ -11515,6 +11637,7 @@
   <w:style w:type="table" w:styleId="123">
     <w:name w:val="Colorful List Accent 2"/>
     <w:basedOn w:val="12"/>
+    <w:qFormat/>
     <w:uiPriority w:val="72"/>
     <w:pPr>
       <w:spacing w:after="0" w:line="240" w:lineRule="auto"/>
@@ -11607,6 +11730,7 @@
   <w:style w:type="table" w:styleId="124">
     <w:name w:val="Colorful List Accent 3"/>
     <w:basedOn w:val="12"/>
+    <w:qFormat/>
     <w:uiPriority w:val="72"/>
     <w:pPr>
       <w:spacing w:after="0" w:line="240" w:lineRule="auto"/>
@@ -11699,6 +11823,7 @@
   <w:style w:type="table" w:styleId="125">
     <w:name w:val="Colorful List Accent 4"/>
     <w:basedOn w:val="12"/>
+    <w:qFormat/>
     <w:uiPriority w:val="72"/>
     <w:pPr>
       <w:spacing w:after="0" w:line="240" w:lineRule="auto"/>
@@ -11791,6 +11916,7 @@
   <w:style w:type="table" w:styleId="126">
     <w:name w:val="Colorful List Accent 5"/>
     <w:basedOn w:val="12"/>
+    <w:qFormat/>
     <w:uiPriority w:val="72"/>
     <w:pPr>
       <w:spacing w:after="0" w:line="240" w:lineRule="auto"/>
@@ -11883,6 +12009,7 @@
   <w:style w:type="table" w:styleId="127">
     <w:name w:val="Colorful List Accent 6"/>
     <w:basedOn w:val="12"/>
+    <w:qFormat/>
     <w:uiPriority w:val="72"/>
     <w:pPr>
       <w:spacing w:after="0" w:line="240" w:lineRule="auto"/>
@@ -12072,6 +12199,7 @@
   <w:style w:type="table" w:styleId="129">
     <w:name w:val="Colorful Grid Accent 1"/>
     <w:basedOn w:val="12"/>
+    <w:qFormat/>
     <w:uiPriority w:val="73"/>
     <w:pPr>
       <w:spacing w:after="0" w:line="240" w:lineRule="auto"/>

</xml_diff>